<commit_message>
feat: implementar modulo matrices de riesgos
</commit_message>
<xml_diff>
--- a/docs/3. Módulo Matrices de Riesgos/Fase 4 - Diseño funcional y experiencia de usuario/Fase_4_Diseno_Funcional_Experiencia_Usuario_Matrices_Riesgos_SGRLA_IHSS.docx
+++ b/docs/3. Módulo Matrices de Riesgos/Fase 4 - Diseño funcional y experiencia de usuario/Fase_4_Diseno_Funcional_Experiencia_Usuario_Matrices_Riesgos_SGRLA_IHSS.docx
@@ -215,7 +215,7 @@
           </w:tcPr>
           <w:p>
             <w:r>
-              <w:t>1.1</w:t>
+              <w:t>1.3</w:t>
             </w:r>
           </w:p>
         </w:tc>
@@ -255,7 +255,7 @@
           </w:tcPr>
           <w:p>
             <w:r>
-              <w:t>03/07/2026</w:t>
+              <w:t>06/07/2026</w:t>
             </w:r>
           </w:p>
         </w:tc>
@@ -295,7 +295,7 @@
           </w:tcPr>
           <w:p>
             <w:r>
-              <w:t>Documento funcional alineado con modelo Oracle</w:t>
+              <w:t>Fase 4 aprobada y cerrada con permisos por módulo</w:t>
             </w:r>
           </w:p>
         </w:tc>
@@ -612,7 +612,7 @@
                 <w:color w:val="0B2545"/>
                 <w:sz w:val="19"/>
               </w:rPr>
-              <w:t>03/07/2026</w:t>
+              <w:t>06/07/2026</w:t>
             </w:r>
           </w:p>
         </w:tc>
@@ -708,7 +708,7 @@
                 <w:color w:val="0B2545"/>
                 <w:sz w:val="19"/>
               </w:rPr>
-              <w:t>03/07/2026</w:t>
+              <w:t>06/07/2026</w:t>
             </w:r>
           </w:p>
         </w:tc>
@@ -763,6 +763,198 @@
                 <w:sz w:val="19"/>
               </w:rPr>
               <w:t>Alineada para aprobación</w:t>
+            </w:r>
+          </w:p>
+        </w:tc>
+      </w:tr>
+      <w:tr>
+        <w:tc>
+          <w:tcPr>
+            <w:tcW w:type="dxa" w:w="900"/>
+          </w:tcPr>
+          <w:p>
+            <w:pPr>
+              <w:jc w:val="center"/>
+            </w:pPr>
+            <w:r>
+              <w:rPr>
+                <w:rFonts w:ascii="Calibri" w:hAnsi="Calibri" w:eastAsia="Calibri"/>
+                <w:b w:val="0"/>
+                <w:i w:val="0"/>
+                <w:color w:val="0B2545"/>
+                <w:sz w:val="19"/>
+              </w:rPr>
+              <w:t>1.2</w:t>
+            </w:r>
+          </w:p>
+        </w:tc>
+        <w:tc>
+          <w:tcPr>
+            <w:tcW w:type="dxa" w:w="1350"/>
+          </w:tcPr>
+          <w:p>
+            <w:pPr>
+              <w:jc w:val="center"/>
+            </w:pPr>
+            <w:r>
+              <w:rPr>
+                <w:rFonts w:ascii="Calibri" w:hAnsi="Calibri" w:eastAsia="Calibri"/>
+                <w:b w:val="0"/>
+                <w:i w:val="0"/>
+                <w:color w:val="0B2545"/>
+                <w:sz w:val="19"/>
+              </w:rPr>
+              <w:t>06/07/2026</w:t>
+            </w:r>
+          </w:p>
+        </w:tc>
+        <w:tc>
+          <w:tcPr>
+            <w:tcW w:type="dxa" w:w="5000"/>
+          </w:tcPr>
+          <w:p>
+            <w:r>
+              <w:rPr>
+                <w:rFonts w:ascii="Calibri" w:hAnsi="Calibri" w:eastAsia="Calibri"/>
+                <w:b w:val="0"/>
+                <w:i w:val="0"/>
+                <w:color w:val="0B2545"/>
+                <w:sz w:val="19"/>
+              </w:rPr>
+              <w:t>Aprobación formal y cierre documental de Fase 4 como base funcional válida para iniciar Fase 5.</w:t>
+            </w:r>
+          </w:p>
+        </w:tc>
+        <w:tc>
+          <w:tcPr>
+            <w:tcW w:type="dxa" w:w="1450"/>
+          </w:tcPr>
+          <w:p>
+            <w:pPr>
+              <w:jc w:val="center"/>
+            </w:pPr>
+            <w:r>
+              <w:rPr>
+                <w:rFonts w:ascii="Calibri" w:hAnsi="Calibri" w:eastAsia="Calibri"/>
+                <w:b w:val="0"/>
+                <w:i w:val="0"/>
+                <w:color w:val="0B2545"/>
+                <w:sz w:val="19"/>
+              </w:rPr>
+              <w:t>Javier Mejía</w:t>
+            </w:r>
+          </w:p>
+        </w:tc>
+        <w:tc>
+          <w:tcPr>
+            <w:tcW w:type="dxa" w:w="660"/>
+          </w:tcPr>
+          <w:p>
+            <w:r>
+              <w:rPr>
+                <w:rFonts w:ascii="Calibri" w:hAnsi="Calibri" w:eastAsia="Calibri"/>
+                <w:b w:val="0"/>
+                <w:i w:val="0"/>
+                <w:color w:val="0B2545"/>
+                <w:sz w:val="19"/>
+              </w:rPr>
+              <w:t>Aprobada y cerrada</w:t>
+            </w:r>
+          </w:p>
+        </w:tc>
+      </w:tr>
+      <w:tr>
+        <w:tc>
+          <w:tcPr>
+            <w:tcW w:type="dxa" w:w="900"/>
+          </w:tcPr>
+          <w:p>
+            <w:pPr>
+              <w:jc w:val="center"/>
+            </w:pPr>
+            <w:r>
+              <w:rPr>
+                <w:rFonts w:ascii="Calibri" w:hAnsi="Calibri" w:eastAsia="Calibri"/>
+                <w:b w:val="0"/>
+                <w:i w:val="0"/>
+                <w:color w:val="0B2545"/>
+                <w:sz w:val="19"/>
+              </w:rPr>
+              <w:t>1.3</w:t>
+            </w:r>
+          </w:p>
+        </w:tc>
+        <w:tc>
+          <w:tcPr>
+            <w:tcW w:type="dxa" w:w="1350"/>
+          </w:tcPr>
+          <w:p>
+            <w:pPr>
+              <w:jc w:val="center"/>
+            </w:pPr>
+            <w:r>
+              <w:rPr>
+                <w:rFonts w:ascii="Calibri" w:hAnsi="Calibri" w:eastAsia="Calibri"/>
+                <w:b w:val="0"/>
+                <w:i w:val="0"/>
+                <w:color w:val="0B2545"/>
+                <w:sz w:val="19"/>
+              </w:rPr>
+              <w:t>06/07/2026</w:t>
+            </w:r>
+          </w:p>
+        </w:tc>
+        <w:tc>
+          <w:tcPr>
+            <w:tcW w:type="dxa" w:w="5000"/>
+          </w:tcPr>
+          <w:p>
+            <w:r>
+              <w:rPr>
+                <w:rFonts w:ascii="Calibri" w:hAnsi="Calibri" w:eastAsia="Calibri"/>
+                <w:b w:val="0"/>
+                <w:i w:val="0"/>
+                <w:color w:val="0B2545"/>
+                <w:sz w:val="19"/>
+              </w:rPr>
+              <w:t>Aclaración de regla institucional: los permisos se mantienen por módulo, conforme al esquema inicial del sistema; no se implementarán permisos por acción.</w:t>
+            </w:r>
+          </w:p>
+        </w:tc>
+        <w:tc>
+          <w:tcPr>
+            <w:tcW w:type="dxa" w:w="1450"/>
+          </w:tcPr>
+          <w:p>
+            <w:pPr>
+              <w:jc w:val="center"/>
+            </w:pPr>
+            <w:r>
+              <w:rPr>
+                <w:rFonts w:ascii="Calibri" w:hAnsi="Calibri" w:eastAsia="Calibri"/>
+                <w:b w:val="0"/>
+                <w:i w:val="0"/>
+                <w:color w:val="0B2545"/>
+                <w:sz w:val="19"/>
+              </w:rPr>
+              <w:t>Javier Mejía</w:t>
+            </w:r>
+          </w:p>
+        </w:tc>
+        <w:tc>
+          <w:tcPr>
+            <w:tcW w:type="dxa" w:w="660"/>
+          </w:tcPr>
+          <w:p>
+            <w:r>
+              <w:rPr>
+                <w:rFonts w:ascii="Calibri" w:hAnsi="Calibri" w:eastAsia="Calibri"/>
+                <w:b w:val="0"/>
+                <w:i w:val="0"/>
+                <w:color w:val="0B2545"/>
+                <w:sz w:val="19"/>
+              </w:rPr>
+              <w:t>Aclaración cerrada</w:t>
             </w:r>
           </w:p>
         </w:tc>
@@ -778,7 +970,7 @@
     </w:p>
     <w:p>
       <w:r>
-        <w:t>La Fase 4 define cómo deberá operar el módulo Matrices de Riesgos desde la experiencia de usuario y el flujo funcional antes de construir pantallas, endpoints definitivos o lógica de cálculo. Este documento convierte la metodología aprobada y el modelo Oracle ejecutado en una especificación funcional aprobable para continuar con contratos backend, seguridad y auditoría en Fase 5.</w:t>
+        <w:t>La Fase 4 define cómo deberá operar el módulo Matrices de Riesgos desde la experiencia de usuario y el flujo funcional antes de construir pantallas, endpoints definitivos o lógica de cálculo. Este documento convierte la metodología aprobada y el modelo Oracle ejecutado en una especificación funcional aprobada y cerrada para continuar con contratos backend, seguridad y auditoría en Fase 5.</w:t>
       </w:r>
     </w:p>
     <w:p>
@@ -1193,7 +1385,7 @@
                 <w:color w:val="0B2545"/>
                 <w:sz w:val="19"/>
               </w:rPr>
-              <w:t>Mapa de pantallas, flujo funcional por rol, estados de matriz, permisos por acción, rutas frontend, validaciones visibles, mensajes, wireframes textuales y criterios de aceptación.</w:t>
+              <w:t>Mapa de pantallas, flujo funcional por rol, estados de matriz, acceso por módulo, rutas frontend, validaciones visibles, mensajes, wireframes textuales y criterios de aceptación.</w:t>
             </w:r>
           </w:p>
         </w:tc>
@@ -4601,7 +4793,12 @@
         <w:pStyle w:val="Heading1"/>
       </w:pPr>
       <w:r>
-        <w:t>9. Permisos por acción</w:t>
+        <w:t>9. Acceso por módulo y roles funcionales</w:t>
+      </w:r>
+    </w:p>
+    <w:p>
+      <w:r>
+        <w:t>La regla institucional aprobada mantiene el esquema inicial del sistema: los permisos se administran por módulo mediante RL_MODULOS y RL_USUARIO_MODULOS. No se implementarán permisos finos por acción. Las acciones listadas en esta sección describen el flujo funcional esperado por perfil operativo, pero no crean un nuevo modelo de autorización por botón, operación o acción individual.</w:t>
       </w:r>
     </w:p>
     <w:tbl>
@@ -4646,7 +4843,7 @@
                 <w:color w:val="0B2545"/>
                 <w:sz w:val="19"/>
               </w:rPr>
-              <w:t>Acción</w:t>
+              <w:t>Actividad funcional</w:t>
             </w:r>
           </w:p>
         </w:tc>
@@ -5978,7 +6175,7 @@
         <w:pStyle w:val="Heading1"/>
       </w:pPr>
       <w:r>
-        <w:t>10. Wireframes textuales aprobables</w:t>
+        <w:t>10. Wireframes textuales aprobados</w:t>
       </w:r>
     </w:p>
     <w:tbl>
@@ -6503,18 +6700,15 @@
             <w:tcW w:type="dxa" w:w="2100"/>
           </w:tcPr>
           <w:p>
-            <w:pPr>
-              <w:jc w:val="center"/>
-            </w:pPr>
-            <w:r>
-              <w:rPr>
-                <w:rFonts w:ascii="Calibri" w:hAnsi="Calibri" w:eastAsia="Calibri"/>
-                <w:b w:val="0"/>
-                <w:i w:val="0"/>
-                <w:color w:val="0B2545"/>
-                <w:sz w:val="19"/>
-              </w:rPr>
-              <w:t>Sin permiso</w:t>
+            <w:r>
+              <w:rPr>
+                <w:rFonts w:ascii="Calibri" w:hAnsi="Calibri" w:eastAsia="Calibri"/>
+                <w:b w:val="0"/>
+                <w:i w:val="0"/>
+                <w:color w:val="0B2545"/>
+                <w:sz w:val="19"/>
+              </w:rPr>
+              <w:t>Sin acceso al módulo</w:t>
             </w:r>
           </w:p>
         </w:tc>
@@ -6531,7 +6725,7 @@
                 <w:color w:val="0B2545"/>
                 <w:sz w:val="19"/>
               </w:rPr>
-              <w:t>Usuario no tiene MOD_ID 10 o acción no permitida.</w:t>
+              <w:t>Usuario no tiene MOD_ID 10 asignado.</w:t>
             </w:r>
           </w:p>
         </w:tc>
@@ -6548,7 +6742,7 @@
                 <w:color w:val="0B2545"/>
                 <w:sz w:val="19"/>
               </w:rPr>
-              <w:t>No tiene permiso para realizar esta acción en Matrices de Riesgos.</w:t>
+              <w:t>No tiene acceso al módulo Matrices de Riesgos.</w:t>
             </w:r>
           </w:p>
         </w:tc>
@@ -8553,7 +8747,7 @@
                 <w:color w:val="0B2545"/>
                 <w:sz w:val="19"/>
               </w:rPr>
-              <w:t>Cumplido en perfiles, permisos y flujo principal.</w:t>
+              <w:t>Cumplido en perfiles funcionales y flujo principal, sin crear permisos por acción.</w:t>
             </w:r>
           </w:p>
         </w:tc>
@@ -8805,7 +8999,7 @@
                 <w:color w:val="0B2545"/>
                 <w:sz w:val="19"/>
               </w:rPr>
-              <w:t>Alineado técnicamente; sujeto a aprobación formal de Javier Mejía.</w:t>
+              <w:t>Cumplido: Fase 4 aprobada formalmente por Javier Mejía el 06/07/2026.</w:t>
             </w:r>
           </w:p>
         </w:tc>
@@ -8816,7 +9010,7 @@
         <w:pStyle w:val="Heading1"/>
       </w:pPr>
       <w:r>
-        <w:t>17. Pendientes controlados</w:t>
+        <w:t>17. Pendientes controlados y reglas cerradas</w:t>
       </w:r>
     </w:p>
     <w:tbl>
@@ -8927,7 +9121,7 @@
                 <w:color w:val="0B2545"/>
                 <w:sz w:val="19"/>
               </w:rPr>
-              <w:t>Permisos finos por acción</w:t>
+              <w:t>Permisos por módulo</w:t>
             </w:r>
           </w:p>
         </w:tc>
@@ -8944,7 +9138,7 @@
                 <w:color w:val="0B2545"/>
                 <w:sz w:val="19"/>
               </w:rPr>
-              <w:t>La base actual asigna módulo; los permisos por acción deben formalizarse si el negocio lo requiere.</w:t>
+              <w:t>Regla cerrada: se mantiene el esquema inicial por módulo; no se implementan permisos finos por acción.</w:t>
             </w:r>
           </w:p>
         </w:tc>
@@ -8953,18 +9147,15 @@
             <w:tcW w:type="dxa" w:w="2860"/>
           </w:tcPr>
           <w:p>
-            <w:pPr>
-              <w:jc w:val="center"/>
-            </w:pPr>
-            <w:r>
-              <w:rPr>
-                <w:rFonts w:ascii="Calibri" w:hAnsi="Calibri" w:eastAsia="Calibri"/>
-                <w:b w:val="0"/>
-                <w:i w:val="0"/>
-                <w:color w:val="0B2545"/>
-                <w:sz w:val="19"/>
-              </w:rPr>
-              <w:t>Fase 5.</w:t>
+            <w:r>
+              <w:rPr>
+                <w:rFonts w:ascii="Calibri" w:hAnsi="Calibri" w:eastAsia="Calibri"/>
+                <w:b w:val="0"/>
+                <w:i w:val="0"/>
+                <w:color w:val="0B2545"/>
+                <w:sz w:val="19"/>
+              </w:rPr>
+              <w:t>Vigente para Fase 5 y fases posteriores.</w:t>
             </w:r>
           </w:p>
         </w:tc>
@@ -9196,12 +9387,347 @@
         <w:pStyle w:val="Heading1"/>
       </w:pPr>
       <w:r>
-        <w:t>18. Decisión de cierre</w:t>
+        <w:t>18. Cierre formal de Fase 4</w:t>
+      </w:r>
+    </w:p>
+    <w:tbl>
+      <w:tblPr>
+        <w:tblStyle w:val="TableGrid"/>
+        <w:tblW w:type="dxa" w:w="9360"/>
+        <w:jc w:val="left"/>
+        <w:tblLook w:firstColumn="1" w:firstRow="1" w:lastColumn="0" w:lastRow="0" w:noHBand="0" w:noVBand="1" w:val="04A0"/>
+        <w:tblInd w:w="120" w:type="dxa"/>
+        <w:tblLayout w:type="fixed"/>
+      </w:tblPr>
+      <w:tblGrid>
+        <w:gridCol w:w="2900"/>
+        <w:gridCol w:w="6460"/>
+      </w:tblGrid>
+      <w:tr>
+        <w:trPr>
+          <w:tblHeader w:val="true"/>
+        </w:trPr>
+        <w:tc>
+          <w:tcPr>
+            <w:tcW w:type="dxa" w:w="2900"/>
+            <w:tcMar>
+              <w:top w:w="80" w:type="dxa"/>
+              <w:start w:w="120" w:type="dxa"/>
+              <w:bottom w:w="80" w:type="dxa"/>
+              <w:end w:w="120" w:type="dxa"/>
+            </w:tcMar>
+            <w:vAlign w:val="center"/>
+            <w:shd w:fill="E2F0D9"/>
+          </w:tcPr>
+          <w:p>
+            <w:r>
+              <w:rPr>
+                <w:rFonts w:ascii="Calibri" w:hAnsi="Calibri" w:eastAsia="Calibri"/>
+                <w:b/>
+                <w:i w:val="0"/>
+                <w:color w:val="0B2545"/>
+                <w:sz w:val="19"/>
+              </w:rPr>
+              <w:t>Campo</w:t>
+            </w:r>
+          </w:p>
+        </w:tc>
+        <w:tc>
+          <w:tcPr>
+            <w:tcW w:type="dxa" w:w="6460"/>
+            <w:tcMar>
+              <w:top w:w="80" w:type="dxa"/>
+              <w:start w:w="120" w:type="dxa"/>
+              <w:bottom w:w="80" w:type="dxa"/>
+              <w:end w:w="120" w:type="dxa"/>
+            </w:tcMar>
+            <w:vAlign w:val="center"/>
+            <w:shd w:fill="E2F0D9"/>
+          </w:tcPr>
+          <w:p>
+            <w:r>
+              <w:rPr>
+                <w:rFonts w:ascii="Calibri" w:hAnsi="Calibri" w:eastAsia="Calibri"/>
+                <w:b/>
+                <w:i w:val="0"/>
+                <w:color w:val="0B2545"/>
+                <w:sz w:val="19"/>
+              </w:rPr>
+              <w:t>Detalle</w:t>
+            </w:r>
+          </w:p>
+        </w:tc>
+      </w:tr>
+      <w:tr>
+        <w:tc>
+          <w:tcPr>
+            <w:tcW w:type="dxa" w:w="2900"/>
+          </w:tcPr>
+          <w:p>
+            <w:r>
+              <w:rPr>
+                <w:rFonts w:ascii="Calibri" w:hAnsi="Calibri" w:eastAsia="Calibri"/>
+                <w:b w:val="0"/>
+                <w:i w:val="0"/>
+                <w:color w:val="0B2545"/>
+                <w:sz w:val="19"/>
+              </w:rPr>
+              <w:t>Estado de Fase 4</w:t>
+            </w:r>
+          </w:p>
+        </w:tc>
+        <w:tc>
+          <w:tcPr>
+            <w:tcW w:type="dxa" w:w="6460"/>
+          </w:tcPr>
+          <w:p>
+            <w:r>
+              <w:rPr>
+                <w:rFonts w:ascii="Calibri" w:hAnsi="Calibri" w:eastAsia="Calibri"/>
+                <w:b w:val="0"/>
+                <w:i w:val="0"/>
+                <w:color w:val="0B2545"/>
+                <w:sz w:val="19"/>
+              </w:rPr>
+              <w:t>Aprobada y cerrada.</w:t>
+            </w:r>
+          </w:p>
+        </w:tc>
+      </w:tr>
+      <w:tr>
+        <w:tc>
+          <w:tcPr>
+            <w:tcW w:type="dxa" w:w="2900"/>
+          </w:tcPr>
+          <w:p>
+            <w:r>
+              <w:rPr>
+                <w:rFonts w:ascii="Calibri" w:hAnsi="Calibri" w:eastAsia="Calibri"/>
+                <w:b w:val="0"/>
+                <w:i w:val="0"/>
+                <w:color w:val="0B2545"/>
+                <w:sz w:val="19"/>
+              </w:rPr>
+              <w:t>Responsable de aprobación</w:t>
+            </w:r>
+          </w:p>
+        </w:tc>
+        <w:tc>
+          <w:tcPr>
+            <w:tcW w:type="dxa" w:w="6460"/>
+          </w:tcPr>
+          <w:p>
+            <w:r>
+              <w:rPr>
+                <w:rFonts w:ascii="Calibri" w:hAnsi="Calibri" w:eastAsia="Calibri"/>
+                <w:b w:val="0"/>
+                <w:i w:val="0"/>
+                <w:color w:val="0B2545"/>
+                <w:sz w:val="19"/>
+              </w:rPr>
+              <w:t>Javier Mejía.</w:t>
+            </w:r>
+          </w:p>
+        </w:tc>
+      </w:tr>
+      <w:tr>
+        <w:tc>
+          <w:tcPr>
+            <w:tcW w:type="dxa" w:w="2900"/>
+          </w:tcPr>
+          <w:p>
+            <w:r>
+              <w:rPr>
+                <w:rFonts w:ascii="Calibri" w:hAnsi="Calibri" w:eastAsia="Calibri"/>
+                <w:b w:val="0"/>
+                <w:i w:val="0"/>
+                <w:color w:val="0B2545"/>
+                <w:sz w:val="19"/>
+              </w:rPr>
+              <w:t>Fecha de aprobación</w:t>
+            </w:r>
+          </w:p>
+        </w:tc>
+        <w:tc>
+          <w:tcPr>
+            <w:tcW w:type="dxa" w:w="6460"/>
+          </w:tcPr>
+          <w:p>
+            <w:pPr>
+              <w:jc w:val="center"/>
+            </w:pPr>
+            <w:r>
+              <w:rPr>
+                <w:rFonts w:ascii="Calibri" w:hAnsi="Calibri" w:eastAsia="Calibri"/>
+                <w:b w:val="0"/>
+                <w:i w:val="0"/>
+                <w:color w:val="0B2545"/>
+                <w:sz w:val="19"/>
+              </w:rPr>
+              <w:t>06/07/2026.</w:t>
+            </w:r>
+          </w:p>
+        </w:tc>
+      </w:tr>
+      <w:tr>
+        <w:tc>
+          <w:tcPr>
+            <w:tcW w:type="dxa" w:w="2900"/>
+          </w:tcPr>
+          <w:p>
+            <w:r>
+              <w:rPr>
+                <w:rFonts w:ascii="Calibri" w:hAnsi="Calibri" w:eastAsia="Calibri"/>
+                <w:b w:val="0"/>
+                <w:i w:val="0"/>
+                <w:color w:val="0B2545"/>
+                <w:sz w:val="19"/>
+              </w:rPr>
+              <w:t>Alcance aprobado</w:t>
+            </w:r>
+          </w:p>
+        </w:tc>
+        <w:tc>
+          <w:tcPr>
+            <w:tcW w:type="dxa" w:w="6460"/>
+          </w:tcPr>
+          <w:p>
+            <w:r>
+              <w:rPr>
+                <w:rFonts w:ascii="Calibri" w:hAnsi="Calibri" w:eastAsia="Calibri"/>
+                <w:b w:val="0"/>
+                <w:i w:val="0"/>
+                <w:color w:val="0B2545"/>
+                <w:sz w:val="19"/>
+              </w:rPr>
+              <w:t>Mapa de pantallas, flujo funcional, estados, acceso por módulo, rutas frontend, validaciones visibles, mensajes, reportería, DNP futuro y criterios de aceptación.</w:t>
+            </w:r>
+          </w:p>
+        </w:tc>
+      </w:tr>
+      <w:tr>
+        <w:tc>
+          <w:tcPr>
+            <w:tcW w:type="dxa" w:w="2900"/>
+          </w:tcPr>
+          <w:p>
+            <w:pPr>
+              <w:jc w:val="center"/>
+            </w:pPr>
+            <w:r>
+              <w:rPr>
+                <w:rFonts w:ascii="Calibri" w:hAnsi="Calibri" w:eastAsia="Calibri"/>
+                <w:b w:val="0"/>
+                <w:i w:val="0"/>
+                <w:color w:val="0B2545"/>
+                <w:sz w:val="19"/>
+              </w:rPr>
+              <w:t>Base técnica</w:t>
+            </w:r>
+          </w:p>
+        </w:tc>
+        <w:tc>
+          <w:tcPr>
+            <w:tcW w:type="dxa" w:w="6460"/>
+          </w:tcPr>
+          <w:p>
+            <w:r>
+              <w:rPr>
+                <w:rFonts w:ascii="Calibri" w:hAnsi="Calibri" w:eastAsia="Calibri"/>
+                <w:b w:val="0"/>
+                <w:i w:val="0"/>
+                <w:color w:val="0B2545"/>
+                <w:sz w:val="19"/>
+              </w:rPr>
+              <w:t>Fase 3 versión 1.9, modelo Oracle validado y CK_RL_MR_MAT_ESTADO alineado con EN_EVALUACION.</w:t>
+            </w:r>
+          </w:p>
+        </w:tc>
+      </w:tr>
+      <w:tr>
+        <w:tc>
+          <w:tcPr>
+            <w:tcW w:type="dxa" w:w="2900"/>
+          </w:tcPr>
+          <w:p>
+            <w:r>
+              <w:rPr>
+                <w:rFonts w:ascii="Calibri" w:hAnsi="Calibri" w:eastAsia="Calibri"/>
+                <w:b w:val="0"/>
+                <w:i w:val="0"/>
+                <w:color w:val="0B2545"/>
+                <w:sz w:val="19"/>
+              </w:rPr>
+              <w:t>Siguiente fase autorizada</w:t>
+            </w:r>
+          </w:p>
+        </w:tc>
+        <w:tc>
+          <w:tcPr>
+            <w:tcW w:type="dxa" w:w="6460"/>
+          </w:tcPr>
+          <w:p>
+            <w:r>
+              <w:rPr>
+                <w:rFonts w:ascii="Calibri" w:hAnsi="Calibri" w:eastAsia="Calibri"/>
+                <w:b w:val="0"/>
+                <w:i w:val="0"/>
+                <w:color w:val="0B2545"/>
+                <w:sz w:val="19"/>
+              </w:rPr>
+              <w:t>Fase 5. Contratos backend, seguridad y auditoría.</w:t>
+            </w:r>
+          </w:p>
+        </w:tc>
+      </w:tr>
+      <w:tr>
+        <w:tc>
+          <w:tcPr>
+            <w:tcW w:type="dxa" w:w="2900"/>
+          </w:tcPr>
+          <w:p>
+            <w:r>
+              <w:rPr>
+                <w:rFonts w:ascii="Calibri" w:hAnsi="Calibri" w:eastAsia="Calibri"/>
+                <w:b w:val="0"/>
+                <w:i w:val="0"/>
+                <w:color w:val="0B2545"/>
+                <w:sz w:val="19"/>
+              </w:rPr>
+              <w:t>Condición de control</w:t>
+            </w:r>
+          </w:p>
+        </w:tc>
+        <w:tc>
+          <w:tcPr>
+            <w:tcW w:type="dxa" w:w="6460"/>
+          </w:tcPr>
+          <w:p>
+            <w:r>
+              <w:rPr>
+                <w:rFonts w:ascii="Calibri" w:hAnsi="Calibri" w:eastAsia="Calibri"/>
+                <w:b w:val="0"/>
+                <w:i w:val="0"/>
+                <w:color w:val="0B2545"/>
+                <w:sz w:val="19"/>
+              </w:rPr>
+              <w:t>No modificar el diseño aprobado sin registrar nueva versión documental y aprobación correspondiente.</w:t>
+            </w:r>
+          </w:p>
+        </w:tc>
+      </w:tr>
+    </w:tbl>
+    <w:p>
+      <w:pPr>
+        <w:pStyle w:val="Heading1"/>
+      </w:pPr>
+      <w:r>
+        <w:t>19. Decisión de cierre</w:t>
       </w:r>
     </w:p>
     <w:p>
       <w:r>
-        <w:t>La Fase 4 queda como documento funcional alineado con el modelo Oracle de Fase 3 y listo para revisión final. Una vez aprobada por Javier Mejía, servirá como base para iniciar Fase 5: contratos backend, seguridad y auditoría. No se debe iniciar programación definitiva del módulo sin aprobar este diseño o registrar los cambios solicitados en una nueva versión del documento.</w:t>
+        <w:t>La Fase 4 queda aprobada y cerrada como documento funcional alineado con el modelo Oracle de Fase 3 y con la regla institucional de permisos por módulo. La versión 1.3 sirve como base formal para iniciar Fase 5: contratos backend, seguridad y auditoría. No se debe modificar el diseño aprobado ni iniciar cambios fuera de alcance sin registrar una nueva versión del documento y obtener aprobación correspondiente.</w:t>
       </w:r>
     </w:p>
     <w:sectPr>
@@ -9231,7 +9757,7 @@
         <w:color w:val="595959"/>
         <w:sz w:val="16"/>
       </w:rPr>
-      <w:t>Documento funcional aprobable antes de construcción</w:t>
+      <w:t>Documento funcional aprobado y cerrado como base para Fase 5</w:t>
     </w:r>
   </w:p>
 </w:ftr>

</xml_diff>